<commit_message>
Add final review PDF
</commit_message>
<xml_diff>
--- a/final-review report/Bantr_Final_Review_Report.docx
+++ b/final-review report/Bantr_Final_Review_Report.docx
@@ -831,14 +831,8 @@
             <w:vAlign w:val="center"/>
           </w:tcPr>
           <w:p>
-            <w:r/>
             <w:r>
-              <w:rPr>
-                <w:rFonts w:ascii="Times New Roman" w:hAnsi="Times New Roman"/>
-                <w:b w:val="0"/>
-                <w:sz w:val="22"/>
-              </w:rPr>
-              <w:t>i</w:t>
+              <w:t>5</w:t>
             </w:r>
           </w:p>
         </w:tc>
@@ -867,14 +861,8 @@
             <w:vAlign w:val="center"/>
           </w:tcPr>
           <w:p>
-            <w:r/>
             <w:r>
-              <w:rPr>
-                <w:rFonts w:ascii="Times New Roman" w:hAnsi="Times New Roman"/>
-                <w:b w:val="0"/>
-                <w:sz w:val="22"/>
-              </w:rPr>
-              <w:t>ii</w:t>
+              <w:t>6</w:t>
             </w:r>
           </w:p>
         </w:tc>
@@ -903,14 +891,8 @@
             <w:vAlign w:val="center"/>
           </w:tcPr>
           <w:p>
-            <w:r/>
             <w:r>
-              <w:rPr>
-                <w:rFonts w:ascii="Times New Roman" w:hAnsi="Times New Roman"/>
-                <w:b w:val="0"/>
-                <w:sz w:val="22"/>
-              </w:rPr>
-              <w:t>iii</w:t>
+              <w:t>8</w:t>
             </w:r>
           </w:p>
         </w:tc>
@@ -939,14 +921,8 @@
             <w:vAlign w:val="center"/>
           </w:tcPr>
           <w:p>
-            <w:r/>
             <w:r>
-              <w:rPr>
-                <w:rFonts w:ascii="Times New Roman" w:hAnsi="Times New Roman"/>
-                <w:b w:val="0"/>
-                <w:sz w:val="22"/>
-              </w:rPr>
-              <w:t>iv</w:t>
+              <w:t>9</w:t>
             </w:r>
           </w:p>
         </w:tc>
@@ -975,14 +951,8 @@
             <w:vAlign w:val="center"/>
           </w:tcPr>
           <w:p>
-            <w:r/>
             <w:r>
-              <w:rPr>
-                <w:rFonts w:ascii="Times New Roman" w:hAnsi="Times New Roman"/>
-                <w:b w:val="0"/>
-                <w:sz w:val="22"/>
-              </w:rPr>
-              <w:t>v</w:t>
+              <w:t>10</w:t>
             </w:r>
           </w:p>
         </w:tc>
@@ -1011,14 +981,8 @@
             <w:vAlign w:val="center"/>
           </w:tcPr>
           <w:p>
-            <w:r/>
             <w:r>
-              <w:rPr>
-                <w:rFonts w:ascii="Times New Roman" w:hAnsi="Times New Roman"/>
-                <w:b w:val="0"/>
-                <w:sz w:val="22"/>
-              </w:rPr>
-              <w:t>1</w:t>
+              <w:t>11</w:t>
             </w:r>
           </w:p>
         </w:tc>
@@ -1047,14 +1011,8 @@
             <w:vAlign w:val="center"/>
           </w:tcPr>
           <w:p>
-            <w:r/>
             <w:r>
-              <w:rPr>
-                <w:rFonts w:ascii="Times New Roman" w:hAnsi="Times New Roman"/>
-                <w:b w:val="0"/>
-                <w:sz w:val="22"/>
-              </w:rPr>
-              <w:t>4</w:t>
+              <w:t>12</w:t>
             </w:r>
           </w:p>
         </w:tc>
@@ -1083,14 +1041,8 @@
             <w:vAlign w:val="center"/>
           </w:tcPr>
           <w:p>
-            <w:r/>
             <w:r>
-              <w:rPr>
-                <w:rFonts w:ascii="Times New Roman" w:hAnsi="Times New Roman"/>
-                <w:b w:val="0"/>
-                <w:sz w:val="22"/>
-              </w:rPr>
-              <w:t>8</w:t>
+              <w:t>13</w:t>
             </w:r>
           </w:p>
         </w:tc>
@@ -1119,14 +1071,8 @@
             <w:vAlign w:val="center"/>
           </w:tcPr>
           <w:p>
-            <w:r/>
             <w:r>
-              <w:rPr>
-                <w:rFonts w:ascii="Times New Roman" w:hAnsi="Times New Roman"/>
-                <w:b w:val="0"/>
-                <w:sz w:val="22"/>
-              </w:rPr>
-              <w:t>13</w:t>
+              <w:t>15</w:t>
             </w:r>
           </w:p>
         </w:tc>
@@ -1155,14 +1101,8 @@
             <w:vAlign w:val="center"/>
           </w:tcPr>
           <w:p>
-            <w:r/>
             <w:r>
-              <w:rPr>
-                <w:rFonts w:ascii="Times New Roman" w:hAnsi="Times New Roman"/>
-                <w:b w:val="0"/>
-                <w:sz w:val="22"/>
-              </w:rPr>
-              <w:t>20</w:t>
+              <w:t>17</w:t>
             </w:r>
           </w:p>
         </w:tc>
@@ -1191,14 +1131,8 @@
             <w:vAlign w:val="center"/>
           </w:tcPr>
           <w:p>
-            <w:r/>
             <w:r>
-              <w:rPr>
-                <w:rFonts w:ascii="Times New Roman" w:hAnsi="Times New Roman"/>
-                <w:b w:val="0"/>
-                <w:sz w:val="22"/>
-              </w:rPr>
-              <w:t>29</w:t>
+              <w:t>19</w:t>
             </w:r>
           </w:p>
         </w:tc>
@@ -1227,14 +1161,8 @@
             <w:vAlign w:val="center"/>
           </w:tcPr>
           <w:p>
-            <w:r/>
             <w:r>
-              <w:rPr>
-                <w:rFonts w:ascii="Times New Roman" w:hAnsi="Times New Roman"/>
-                <w:b w:val="0"/>
-                <w:sz w:val="22"/>
-              </w:rPr>
-              <w:t>35</w:t>
+              <w:t>21</w:t>
             </w:r>
           </w:p>
         </w:tc>
@@ -1263,14 +1191,8 @@
             <w:vAlign w:val="center"/>
           </w:tcPr>
           <w:p>
-            <w:r/>
             <w:r>
-              <w:rPr>
-                <w:rFonts w:ascii="Times New Roman" w:hAnsi="Times New Roman"/>
-                <w:b w:val="0"/>
-                <w:sz w:val="22"/>
-              </w:rPr>
-              <w:t>38</w:t>
+              <w:t>22</w:t>
             </w:r>
           </w:p>
         </w:tc>
@@ -1299,14 +1221,8 @@
             <w:vAlign w:val="center"/>
           </w:tcPr>
           <w:p>
-            <w:r/>
             <w:r>
-              <w:rPr>
-                <w:rFonts w:ascii="Times New Roman" w:hAnsi="Times New Roman"/>
-                <w:b w:val="0"/>
-                <w:sz w:val="22"/>
-              </w:rPr>
-              <w:t>40</w:t>
+              <w:t>23</w:t>
             </w:r>
           </w:p>
         </w:tc>
@@ -2768,11 +2684,6 @@
           <w:sz w:val="24"/>
         </w:rPr>
         <w:t>The primary user is a student or debate learner who wants repeated practice with an opponent that can be customized for different topics, viewpoints, and difficulty levels.</w:t>
-      </w:r>
-    </w:p>
-    <w:p>
-      <w:r>
-        <w:br w:type="page"/>
       </w:r>
     </w:p>
     <w:p>
@@ -5676,80 +5587,80 @@
     </w:p>
     <w:p>
       <w:pPr>
-        <w:pStyle w:val="ListNumber"/>
         <w:spacing w:line="312" w:lineRule="auto" w:after="60"/>
+        <w:ind w:left="283" w:hanging="283"/>
       </w:pPr>
       <w:r>
         <w:rPr>
           <w:rFonts w:ascii="Times New Roman" w:hAnsi="Times New Roman"/>
           <w:sz w:val="24"/>
         </w:rPr>
-        <w:t>The user signs in through email/password or Google OAuth.</w:t>
+        <w:t>1. The user signs in through email/password or Google OAuth.</w:t>
       </w:r>
     </w:p>
     <w:p>
       <w:pPr>
-        <w:pStyle w:val="ListNumber"/>
         <w:spacing w:line="312" w:lineRule="auto" w:after="60"/>
+        <w:ind w:left="283" w:hanging="283"/>
       </w:pPr>
       <w:r>
         <w:rPr>
           <w:rFonts w:ascii="Times New Roman" w:hAnsi="Times New Roman"/>
           <w:sz w:val="24"/>
         </w:rPr>
-        <w:t>The dashboard and My Debates pages show existing debates and status.</w:t>
+        <w:t>2. The dashboard and My Debates pages show existing debates and status.</w:t>
       </w:r>
     </w:p>
     <w:p>
       <w:pPr>
-        <w:pStyle w:val="ListNumber"/>
         <w:spacing w:line="312" w:lineRule="auto" w:after="60"/>
+        <w:ind w:left="283" w:hanging="283"/>
       </w:pPr>
       <w:r>
         <w:rPr>
           <w:rFonts w:ascii="Times New Roman" w:hAnsi="Times New Roman"/>
           <w:sz w:val="24"/>
         </w:rPr>
-        <w:t>Create Debate collects title, topic, AI prompt, and voice settings.</w:t>
+        <w:t>3. Create Debate collects title, topic, AI prompt, and voice settings.</w:t>
       </w:r>
     </w:p>
     <w:p>
       <w:pPr>
-        <w:pStyle w:val="ListNumber"/>
         <w:spacing w:line="312" w:lineRule="auto" w:after="60"/>
+        <w:ind w:left="283" w:hanging="283"/>
       </w:pPr>
       <w:r>
         <w:rPr>
           <w:rFonts w:ascii="Times New Roman" w:hAnsi="Times New Roman"/>
           <w:sz w:val="24"/>
         </w:rPr>
-        <w:t>Live Debate connects to the LiveKit room using the backend token.</w:t>
+        <w:t>4. Live Debate connects to the LiveKit room using the backend token.</w:t>
       </w:r>
     </w:p>
     <w:p>
       <w:pPr>
-        <w:pStyle w:val="ListNumber"/>
         <w:spacing w:line="312" w:lineRule="auto" w:after="60"/>
+        <w:ind w:left="283" w:hanging="283"/>
       </w:pPr>
       <w:r>
         <w:rPr>
           <w:rFonts w:ascii="Times New Roman" w:hAnsi="Times New Roman"/>
           <w:sz w:val="24"/>
         </w:rPr>
-        <w:t>Debate Detail, Transcript, and Analysis pages expose post-session artifacts.</w:t>
+        <w:t>5. Debate Detail, Transcript, and Analysis pages expose post-session artifacts.</w:t>
       </w:r>
     </w:p>
     <w:p>
       <w:pPr>
-        <w:pStyle w:val="ListNumber"/>
         <w:spacing w:line="312" w:lineRule="auto" w:after="60"/>
+        <w:ind w:left="283" w:hanging="283"/>
       </w:pPr>
       <w:r>
         <w:rPr>
           <w:rFonts w:ascii="Times New Roman" w:hAnsi="Times New Roman"/>
           <w:sz w:val="24"/>
         </w:rPr>
-        <w:t>Chat provides follow-up coaching using stored debate memory.</w:t>
+        <w:t>6. Chat provides follow-up coaching using stored debate memory.</w:t>
       </w:r>
     </w:p>
     <w:p>
@@ -6420,119 +6331,119 @@
     </w:p>
     <w:p>
       <w:pPr>
-        <w:pStyle w:val="ListNumber"/>
         <w:spacing w:line="312" w:lineRule="auto" w:after="60"/>
+        <w:ind w:left="283" w:hanging="283"/>
       </w:pPr>
       <w:r>
         <w:rPr>
           <w:rFonts w:ascii="Times New Roman" w:hAnsi="Times New Roman"/>
           <w:sz w:val="24"/>
         </w:rPr>
-        <w:t>Start the FastAPI server with uvicorn.</w:t>
+        <w:t>1. Start the FastAPI server with uvicorn.</w:t>
       </w:r>
     </w:p>
     <w:p>
       <w:pPr>
-        <w:pStyle w:val="ListNumber"/>
         <w:spacing w:line="312" w:lineRule="auto" w:after="60"/>
+        <w:ind w:left="283" w:hanging="283"/>
       </w:pPr>
       <w:r>
         <w:rPr>
           <w:rFonts w:ascii="Times New Roman" w:hAnsi="Times New Roman"/>
           <w:sz w:val="24"/>
         </w:rPr>
-        <w:t>Start the LiveKit agent worker in a second terminal.</w:t>
+        <w:t>2. Start the LiveKit agent worker in a second terminal.</w:t>
       </w:r>
     </w:p>
     <w:p>
       <w:pPr>
-        <w:pStyle w:val="ListNumber"/>
         <w:spacing w:line="312" w:lineRule="auto" w:after="60"/>
+        <w:ind w:left="283" w:hanging="283"/>
       </w:pPr>
       <w:r>
         <w:rPr>
           <w:rFonts w:ascii="Times New Roman" w:hAnsi="Times New Roman"/>
           <w:sz w:val="24"/>
         </w:rPr>
-        <w:t>Check /health/live, /health/ready, and /health/integrations.</w:t>
+        <w:t>3. Check /health/live, /health/ready, and /health/integrations.</w:t>
       </w:r>
     </w:p>
     <w:p>
       <w:pPr>
-        <w:pStyle w:val="ListNumber"/>
         <w:spacing w:line="312" w:lineRule="auto" w:after="60"/>
+        <w:ind w:left="283" w:hanging="283"/>
       </w:pPr>
       <w:r>
         <w:rPr>
           <w:rFonts w:ascii="Times New Roman" w:hAnsi="Times New Roman"/>
           <w:sz w:val="24"/>
         </w:rPr>
-        <w:t>Login and verify auth cookie and CSRF token.</w:t>
+        <w:t>4. Login and verify auth cookie and CSRF token.</w:t>
       </w:r>
     </w:p>
     <w:p>
       <w:pPr>
-        <w:pStyle w:val="ListNumber"/>
         <w:spacing w:line="312" w:lineRule="auto" w:after="60"/>
+        <w:ind w:left="283" w:hanging="283"/>
       </w:pPr>
       <w:r>
         <w:rPr>
           <w:rFonts w:ascii="Times New Roman" w:hAnsi="Times New Roman"/>
           <w:sz w:val="24"/>
         </w:rPr>
-        <w:t>Create a debate and start the LiveKit room.</w:t>
+        <w:t>5. Create a debate and start the LiveKit room.</w:t>
       </w:r>
     </w:p>
     <w:p>
       <w:pPr>
-        <w:pStyle w:val="ListNumber"/>
         <w:spacing w:line="312" w:lineRule="auto" w:after="60"/>
+        <w:ind w:left="283" w:hanging="283"/>
       </w:pPr>
       <w:r>
         <w:rPr>
           <w:rFonts w:ascii="Times New Roman" w:hAnsi="Times New Roman"/>
           <w:sz w:val="24"/>
         </w:rPr>
-        <w:t>End the debate and wait for transcript completion.</w:t>
+        <w:t>6. End the debate and wait for transcript completion.</w:t>
       </w:r>
     </w:p>
     <w:p>
       <w:pPr>
-        <w:pStyle w:val="ListNumber"/>
         <w:spacing w:line="312" w:lineRule="auto" w:after="60"/>
+        <w:ind w:left="283" w:hanging="283"/>
       </w:pPr>
       <w:r>
         <w:rPr>
           <w:rFonts w:ascii="Times New Roman" w:hAnsi="Times New Roman"/>
           <w:sz w:val="24"/>
         </w:rPr>
-        <w:t>Run analysis and verify structured results.</w:t>
+        <w:t>7. Run analysis and verify structured results.</w:t>
       </w:r>
     </w:p>
     <w:p>
       <w:pPr>
-        <w:pStyle w:val="ListNumber"/>
         <w:spacing w:line="312" w:lineRule="auto" w:after="60"/>
+        <w:ind w:left="283" w:hanging="283"/>
       </w:pPr>
       <w:r>
         <w:rPr>
           <w:rFonts w:ascii="Times New Roman" w:hAnsi="Times New Roman"/>
           <w:sz w:val="24"/>
         </w:rPr>
-        <w:t>Ask the chat assistant a question about the completed debate.</w:t>
+        <w:t>8. Ask the chat assistant a question about the completed debate.</w:t>
       </w:r>
     </w:p>
     <w:p>
       <w:pPr>
-        <w:pStyle w:val="ListNumber"/>
         <w:spacing w:line="312" w:lineRule="auto" w:after="60"/>
+        <w:ind w:left="283" w:hanging="283"/>
       </w:pPr>
       <w:r>
         <w:rPr>
           <w:rFonts w:ascii="Times New Roman" w:hAnsi="Times New Roman"/>
           <w:sz w:val="24"/>
         </w:rPr>
-        <w:t>Confirm chat history persists and context debates are returned.</w:t>
+        <w:t>9. Confirm chat history persists and context debates are returned.</w:t>
       </w:r>
     </w:p>
     <w:p>
@@ -6820,119 +6731,119 @@
     </w:p>
     <w:p>
       <w:pPr>
-        <w:pStyle w:val="ListNumber"/>
         <w:spacing w:line="312" w:lineRule="auto" w:after="60"/>
+        <w:ind w:left="283" w:hanging="283"/>
       </w:pPr>
       <w:r>
         <w:rPr>
           <w:rFonts w:ascii="Times New Roman" w:hAnsi="Times New Roman"/>
           <w:sz w:val="24"/>
         </w:rPr>
-        <w:t>FastAPI Documentation. (2026). FastAPI framework documentation. https://fastapi.tiangolo.com/</w:t>
+        <w:t>1. FastAPI Documentation. (2026). FastAPI framework documentation. https://fastapi.tiangolo.com/</w:t>
       </w:r>
     </w:p>
     <w:p>
       <w:pPr>
-        <w:pStyle w:val="ListNumber"/>
         <w:spacing w:line="312" w:lineRule="auto" w:after="60"/>
+        <w:ind w:left="283" w:hanging="283"/>
       </w:pPr>
       <w:r>
         <w:rPr>
           <w:rFonts w:ascii="Times New Roman" w:hAnsi="Times New Roman"/>
           <w:sz w:val="24"/>
         </w:rPr>
-        <w:t>LiveKit Documentation. (2026). LiveKit WebRTC and Agents documentation. https://docs.livekit.io/</w:t>
+        <w:t>2. LiveKit Documentation. (2026). LiveKit WebRTC and Agents documentation. https://docs.livekit.io/</w:t>
       </w:r>
     </w:p>
     <w:p>
       <w:pPr>
-        <w:pStyle w:val="ListNumber"/>
         <w:spacing w:line="312" w:lineRule="auto" w:after="60"/>
+        <w:ind w:left="283" w:hanging="283"/>
       </w:pPr>
       <w:r>
         <w:rPr>
           <w:rFonts w:ascii="Times New Roman" w:hAnsi="Times New Roman"/>
           <w:sz w:val="24"/>
         </w:rPr>
-        <w:t>OpenAI Documentation. (2026). OpenAI API platform documentation. https://platform.openai.com/docs/</w:t>
+        <w:t>3. OpenAI Documentation. (2026). OpenAI API platform documentation. https://platform.openai.com/docs/</w:t>
       </w:r>
     </w:p>
     <w:p>
       <w:pPr>
-        <w:pStyle w:val="ListNumber"/>
         <w:spacing w:line="312" w:lineRule="auto" w:after="60"/>
+        <w:ind w:left="283" w:hanging="283"/>
       </w:pPr>
       <w:r>
         <w:rPr>
           <w:rFonts w:ascii="Times New Roman" w:hAnsi="Times New Roman"/>
           <w:sz w:val="24"/>
         </w:rPr>
-        <w:t>SQLAlchemy Documentation. (2026). SQLAlchemy 2.0 async ORM documentation. https://docs.sqlalchemy.org/</w:t>
+        <w:t>4. SQLAlchemy Documentation. (2026). SQLAlchemy 2.0 async ORM documentation. https://docs.sqlalchemy.org/</w:t>
       </w:r>
     </w:p>
     <w:p>
       <w:pPr>
-        <w:pStyle w:val="ListNumber"/>
         <w:spacing w:line="312" w:lineRule="auto" w:after="60"/>
+        <w:ind w:left="283" w:hanging="283"/>
       </w:pPr>
       <w:r>
         <w:rPr>
           <w:rFonts w:ascii="Times New Roman" w:hAnsi="Times New Roman"/>
           <w:sz w:val="24"/>
         </w:rPr>
-        <w:t>pgvector Documentation. (2026). Open-source vector similarity search for PostgreSQL. https://github.com/pgvector/pgvector</w:t>
+        <w:t>5. pgvector Documentation. (2026). Open-source vector similarity search for PostgreSQL. https://github.com/pgvector/pgvector</w:t>
       </w:r>
     </w:p>
     <w:p>
       <w:pPr>
-        <w:pStyle w:val="ListNumber"/>
         <w:spacing w:line="312" w:lineRule="auto" w:after="60"/>
+        <w:ind w:left="283" w:hanging="283"/>
       </w:pPr>
       <w:r>
         <w:rPr>
           <w:rFonts w:ascii="Times New Roman" w:hAnsi="Times New Roman"/>
           <w:sz w:val="24"/>
         </w:rPr>
-        <w:t>React Documentation. (2026). React library documentation. https://react.dev/</w:t>
+        <w:t>6. React Documentation. (2026). React library documentation. https://react.dev/</w:t>
       </w:r>
     </w:p>
     <w:p>
       <w:pPr>
-        <w:pStyle w:val="ListNumber"/>
         <w:spacing w:line="312" w:lineRule="auto" w:after="60"/>
+        <w:ind w:left="283" w:hanging="283"/>
       </w:pPr>
       <w:r>
         <w:rPr>
           <w:rFonts w:ascii="Times New Roman" w:hAnsi="Times New Roman"/>
           <w:sz w:val="24"/>
         </w:rPr>
-        <w:t>Vite Documentation. (2026). Frontend build tooling documentation. https://vite.dev/</w:t>
+        <w:t>7. Vite Documentation. (2026). Frontend build tooling documentation. https://vite.dev/</w:t>
       </w:r>
     </w:p>
     <w:p>
       <w:pPr>
-        <w:pStyle w:val="ListNumber"/>
         <w:spacing w:line="312" w:lineRule="auto" w:after="60"/>
+        <w:ind w:left="283" w:hanging="283"/>
       </w:pPr>
       <w:r>
         <w:rPr>
           <w:rFonts w:ascii="Times New Roman" w:hAnsi="Times New Roman"/>
           <w:sz w:val="24"/>
         </w:rPr>
-        <w:t>Alembic Documentation. (2026). Database migration tool for SQLAlchemy. https://alembic.sqlalchemy.org/</w:t>
+        <w:t>8. Alembic Documentation. (2026). Database migration tool for SQLAlchemy. https://alembic.sqlalchemy.org/</w:t>
       </w:r>
     </w:p>
     <w:p>
       <w:pPr>
-        <w:pStyle w:val="ListNumber"/>
         <w:spacing w:line="312" w:lineRule="auto" w:after="60"/>
+        <w:ind w:left="283" w:hanging="283"/>
       </w:pPr>
       <w:r>
         <w:rPr>
           <w:rFonts w:ascii="Times New Roman" w:hAnsi="Times New Roman"/>
           <w:sz w:val="24"/>
         </w:rPr>
-        <w:t>Bantr repository documentation. (2026). Setup guide, demo checklist, engineering standards, and Bantr debate platform design specification.</w:t>
+        <w:t>9. Bantr repository documentation. (2026). Setup guide, demo checklist, engineering standards, and Bantr debate platform design specification.</w:t>
       </w:r>
     </w:p>
     <w:p>

</xml_diff>

<commit_message>
Replace report text diagrams with visuals
</commit_message>
<xml_diff>
--- a/final-review report/Bantr_Final_Review_Report.docx
+++ b/final-review report/Bantr_Final_Review_Report.docx
@@ -4296,21 +4296,41 @@
       <w:pPr>
         <w:spacing w:line="240" w:lineRule="auto"/>
         <w:ind w:left="283"/>
+        <w:jc w:val="center"/>
       </w:pPr>
       <w:r>
-        <w:rPr>
-          <w:rFonts w:ascii="Courier New" w:hAnsi="Courier New"/>
-          <w:sz w:val="20"/>
-        </w:rPr>
-        <w:t>React Frontend  &lt;--&gt;  FastAPI API  &lt;--&gt;  PostgreSQL + pgvector</w:t>
-        <w:br/>
-        <w:t xml:space="preserve">      |                   |</w:t>
-        <w:br/>
-        <w:t xml:space="preserve">      |                   +--&gt; OpenAI analysis, embeddings, chat</w:t>
-        <w:br/>
-        <w:t xml:space="preserve">      v</w:t>
-        <w:br/>
-        <w:t>LiveKit Room  &lt;--&gt;  LiveKit Agent Worker  &lt;--&gt;  LiveKit inference services</w:t>
+        <w:drawing>
+          <wp:inline xmlns:a="http://schemas.openxmlformats.org/drawingml/2006/main" xmlns:pic="http://schemas.openxmlformats.org/drawingml/2006/picture">
+            <wp:extent cx="5238000" cy="2653920"/>
+            <wp:docPr id="3" name="Picture 3"/>
+            <wp:cNvGraphicFramePr>
+              <a:graphicFrameLocks noChangeAspect="1"/>
+            </wp:cNvGraphicFramePr>
+            <a:graphic>
+              <a:graphicData uri="http://schemas.openxmlformats.org/drawingml/2006/picture">
+                <pic:pic>
+                  <pic:nvPicPr>
+                    <pic:cNvPr id="0" name="bantr_architecture_diagram.png"/>
+                    <pic:cNvPicPr/>
+                  </pic:nvPicPr>
+                  <pic:blipFill>
+                    <a:blip r:embed="rId12"/>
+                    <a:stretch>
+                      <a:fillRect/>
+                    </a:stretch>
+                  </pic:blipFill>
+                  <pic:spPr>
+                    <a:xfrm>
+                      <a:off x="0" y="0"/>
+                      <a:ext cx="5238000" cy="2653920"/>
+                    </a:xfrm>
+                    <a:prstGeom prst="rect"/>
+                  </pic:spPr>
+                </pic:pic>
+              </a:graphicData>
+            </a:graphic>
+          </wp:inline>
+        </w:drawing>
       </w:r>
     </w:p>
     <w:p>
@@ -4421,15 +4441,41 @@
       <w:pPr>
         <w:spacing w:line="240" w:lineRule="auto"/>
         <w:ind w:left="283"/>
+        <w:jc w:val="center"/>
       </w:pPr>
       <w:r>
-        <w:rPr>
-          <w:rFonts w:ascii="Courier New" w:hAnsi="Courier New"/>
-          <w:sz w:val="20"/>
-        </w:rPr>
-        <w:t>pending --start--&gt; active --end--&gt; ending --agent transcript saved--&gt; completed</w:t>
-        <w:br/>
-        <w:t xml:space="preserve">        \-------------- provider or worker failure ----------------&gt; failed</w:t>
+        <w:drawing>
+          <wp:inline xmlns:a="http://schemas.openxmlformats.org/drawingml/2006/main" xmlns:pic="http://schemas.openxmlformats.org/drawingml/2006/picture">
+            <wp:extent cx="5238000" cy="1815840"/>
+            <wp:docPr id="4" name="Picture 4"/>
+            <wp:cNvGraphicFramePr>
+              <a:graphicFrameLocks noChangeAspect="1"/>
+            </wp:cNvGraphicFramePr>
+            <a:graphic>
+              <a:graphicData uri="http://schemas.openxmlformats.org/drawingml/2006/picture">
+                <pic:pic>
+                  <pic:nvPicPr>
+                    <pic:cNvPr id="0" name="bantr_lifecycle_diagram.png"/>
+                    <pic:cNvPicPr/>
+                  </pic:nvPicPr>
+                  <pic:blipFill>
+                    <a:blip r:embed="rId13"/>
+                    <a:stretch>
+                      <a:fillRect/>
+                    </a:stretch>
+                  </pic:blipFill>
+                  <pic:spPr>
+                    <a:xfrm>
+                      <a:off x="0" y="0"/>
+                      <a:ext cx="5238000" cy="1815840"/>
+                    </a:xfrm>
+                    <a:prstGeom prst="rect"/>
+                  </pic:spPr>
+                </pic:pic>
+              </a:graphicData>
+            </a:graphic>
+          </wp:inline>
+        </w:drawing>
       </w:r>
     </w:p>
     <w:p>

</xml_diff>